<commit_message>
trunk fork for "combat system" branch
It's oldest available TNF roleplay server after SDK release

sdk@24
FOnlineSource@101
engine commit b441ceb359f6fc4dd5eff8dd5a7ca57d9e5097c1
SERVER_VERSION               0x00000355
CLIENT_VERSION               0x00000272
FO_PROTOCOL_VERSION          0xF087
</commit_message>
<xml_diff>
--- a/Craft.docx
+++ b/Craft.docx
@@ -1131,8 +1131,29 @@
             <w:tcW w:w="2268" w:type="dxa"/>
           </w:tcPr>
           <w:p>
-            <w:r>
-              <w:t>Инструменты.</w:t>
+            <w:pPr>
+              <w:rPr>
+                <w:lang w:val="en-US"/>
+              </w:rPr>
+            </w:pPr>
+            <w:r>
+              <w:t>Инструмент</w:t>
+            </w:r>
+            <w:proofErr w:type="gramStart"/>
+            <w:r>
+              <w:t>ы</w:t>
+            </w:r>
+            <w:r>
+              <w:t>(</w:t>
+            </w:r>
+            <w:proofErr w:type="spellStart"/>
+            <w:proofErr w:type="gramEnd"/>
+            <w:r>
+              <w:t>Суперремнабор</w:t>
+            </w:r>
+            <w:proofErr w:type="spellEnd"/>
+            <w:r>
+              <w:t>)</w:t>
             </w:r>
           </w:p>
         </w:tc>
@@ -1220,13 +1241,19 @@
           </w:tcPr>
           <w:p>
             <w:r>
-              <w:t>Инструменты</w:t>
-            </w:r>
-            <w:proofErr w:type="gramStart"/>
-            <w:r>
-              <w:t xml:space="preserve"> .</w:t>
-            </w:r>
-            <w:proofErr w:type="gramEnd"/>
+              <w:t xml:space="preserve">Инструменты </w:t>
+            </w:r>
+            <w:r>
+              <w:t>(</w:t>
+            </w:r>
+            <w:proofErr w:type="spellStart"/>
+            <w:r>
+              <w:t>Суперремнабор</w:t>
+            </w:r>
+            <w:proofErr w:type="spellEnd"/>
+            <w:r>
+              <w:t>)</w:t>
+            </w:r>
           </w:p>
         </w:tc>
         <w:tc>
@@ -1321,13 +1348,22 @@
           </w:tcPr>
           <w:p>
             <w:r>
-              <w:t>Инструменты</w:t>
-            </w:r>
-            <w:proofErr w:type="gramStart"/>
-            <w:r>
-              <w:t xml:space="preserve"> ,</w:t>
-            </w:r>
-            <w:proofErr w:type="gramEnd"/>
+              <w:t xml:space="preserve">Инструменты </w:t>
+            </w:r>
+            <w:r>
+              <w:t>(</w:t>
+            </w:r>
+            <w:proofErr w:type="spellStart"/>
+            <w:r>
+              <w:t>Суперремнабор</w:t>
+            </w:r>
+            <w:proofErr w:type="spellEnd"/>
+            <w:r>
+              <w:t>)</w:t>
+            </w:r>
+            <w:r>
+              <w:t>,</w:t>
+            </w:r>
           </w:p>
           <w:p>
             <w:r>
@@ -1429,7 +1465,23 @@
           </w:tcPr>
           <w:p>
             <w:r>
-              <w:t>Инструменты.</w:t>
+              <w:t>Инструменты</w:t>
+            </w:r>
+          </w:p>
+          <w:p>
+            <w:r>
+              <w:t>(</w:t>
+            </w:r>
+            <w:proofErr w:type="spellStart"/>
+            <w:r>
+              <w:t>Суперремнабор</w:t>
+            </w:r>
+            <w:proofErr w:type="spellEnd"/>
+            <w:r>
+              <w:t>)</w:t>
+            </w:r>
+            <w:r>
+              <w:t>.</w:t>
             </w:r>
           </w:p>
         </w:tc>
@@ -1844,7 +1896,30 @@
           </w:tcPr>
           <w:p>
             <w:r>
-              <w:t>Инструменты,</w:t>
+              <w:t>Инструмент</w:t>
+            </w:r>
+            <w:proofErr w:type="gramStart"/>
+            <w:r>
+              <w:t>ы</w:t>
+            </w:r>
+            <w:r>
+              <w:t>(</w:t>
+            </w:r>
+            <w:proofErr w:type="spellStart"/>
+            <w:proofErr w:type="gramEnd"/>
+            <w:r>
+              <w:t>суперр</w:t>
+            </w:r>
+            <w:r>
+              <w:lastRenderedPageBreak/>
+              <w:t>емнабор</w:t>
+            </w:r>
+            <w:proofErr w:type="spellEnd"/>
+            <w:r>
+              <w:t>)</w:t>
+            </w:r>
+            <w:r>
+              <w:t>,</w:t>
             </w:r>
           </w:p>
           <w:p>
@@ -1867,6 +1942,7 @@
               <w:rPr>
                 <w:b/>
               </w:rPr>
+              <w:lastRenderedPageBreak/>
               <w:t>1</w:t>
             </w:r>
           </w:p>
@@ -2198,7 +2274,26 @@
           </w:tcPr>
           <w:p>
             <w:r>
-              <w:t>Инструменты.</w:t>
+              <w:t>Инструмент</w:t>
+            </w:r>
+            <w:proofErr w:type="gramStart"/>
+            <w:r>
+              <w:t>ы</w:t>
+            </w:r>
+            <w:r>
+              <w:t>(</w:t>
+            </w:r>
+            <w:proofErr w:type="spellStart"/>
+            <w:proofErr w:type="gramEnd"/>
+            <w:r>
+              <w:t>суперремнабор</w:t>
+            </w:r>
+            <w:proofErr w:type="spellEnd"/>
+            <w:r>
+              <w:t>)</w:t>
+            </w:r>
+            <w:r>
+              <w:t>.</w:t>
             </w:r>
           </w:p>
         </w:tc>
@@ -3188,8 +3283,24 @@
             <w:tcW w:w="2268" w:type="dxa"/>
           </w:tcPr>
           <w:p>
-            <w:r>
-              <w:t>Инструменты.</w:t>
+            <w:proofErr w:type="spellStart"/>
+            <w:r>
+              <w:t>Инструменты</w:t>
+            </w:r>
+            <w:proofErr w:type="gramStart"/>
+            <w:r>
+              <w:t>.</w:t>
+            </w:r>
+            <w:r>
+              <w:t>С</w:t>
+            </w:r>
+            <w:proofErr w:type="gramEnd"/>
+            <w:r>
+              <w:t>уперремнабор</w:t>
+            </w:r>
+            <w:proofErr w:type="spellEnd"/>
+            <w:r>
+              <w:t>)</w:t>
             </w:r>
           </w:p>
         </w:tc>
@@ -3969,7 +4080,26 @@
           </w:tcPr>
           <w:p>
             <w:r>
-              <w:t>Инструменты.</w:t>
+              <w:t>Инструмент</w:t>
+            </w:r>
+            <w:proofErr w:type="gramStart"/>
+            <w:r>
+              <w:t>ы</w:t>
+            </w:r>
+            <w:r>
+              <w:t>(</w:t>
+            </w:r>
+            <w:proofErr w:type="spellStart"/>
+            <w:proofErr w:type="gramEnd"/>
+            <w:r>
+              <w:t>суперремнабор</w:t>
+            </w:r>
+            <w:proofErr w:type="spellEnd"/>
+            <w:r>
+              <w:t>)</w:t>
+            </w:r>
+            <w:r>
+              <w:t>.</w:t>
             </w:r>
           </w:p>
         </w:tc>
@@ -4173,7 +4303,26 @@
           </w:tcPr>
           <w:p>
             <w:r>
-              <w:t>Инструменты,</w:t>
+              <w:t>Инструмент</w:t>
+            </w:r>
+            <w:proofErr w:type="gramStart"/>
+            <w:r>
+              <w:t>ы</w:t>
+            </w:r>
+            <w:r>
+              <w:t>(</w:t>
+            </w:r>
+            <w:proofErr w:type="spellStart"/>
+            <w:proofErr w:type="gramEnd"/>
+            <w:r>
+              <w:t>суперремнабор</w:t>
+            </w:r>
+            <w:proofErr w:type="spellEnd"/>
+            <w:r>
+              <w:t>)</w:t>
+            </w:r>
+            <w:r>
+              <w:t>,</w:t>
             </w:r>
           </w:p>
           <w:p>
@@ -4373,7 +4522,26 @@
           </w:tcPr>
           <w:p>
             <w:r>
-              <w:t>Инструменты.</w:t>
+              <w:t>Инструмент</w:t>
+            </w:r>
+            <w:proofErr w:type="gramStart"/>
+            <w:r>
+              <w:t>ы</w:t>
+            </w:r>
+            <w:r>
+              <w:t>(</w:t>
+            </w:r>
+            <w:proofErr w:type="spellStart"/>
+            <w:proofErr w:type="gramEnd"/>
+            <w:r>
+              <w:t>суперремнабор</w:t>
+            </w:r>
+            <w:proofErr w:type="spellEnd"/>
+            <w:r>
+              <w:t>)</w:t>
+            </w:r>
+            <w:r>
+              <w:t>.</w:t>
             </w:r>
           </w:p>
         </w:tc>
@@ -4554,7 +4722,26 @@
           </w:tcPr>
           <w:p>
             <w:r>
-              <w:t>Инструменты.</w:t>
+              <w:t>Инструмент</w:t>
+            </w:r>
+            <w:proofErr w:type="gramStart"/>
+            <w:r>
+              <w:t>ы</w:t>
+            </w:r>
+            <w:r>
+              <w:t>(</w:t>
+            </w:r>
+            <w:proofErr w:type="spellStart"/>
+            <w:proofErr w:type="gramEnd"/>
+            <w:r>
+              <w:t>суперремнабор</w:t>
+            </w:r>
+            <w:proofErr w:type="spellEnd"/>
+            <w:r>
+              <w:t>)</w:t>
+            </w:r>
+            <w:r>
+              <w:t>.</w:t>
             </w:r>
           </w:p>
         </w:tc>
@@ -5183,7 +5370,26 @@
           </w:tcPr>
           <w:p>
             <w:r>
-              <w:t>Инструменты,</w:t>
+              <w:t>Инструмент</w:t>
+            </w:r>
+            <w:proofErr w:type="gramStart"/>
+            <w:r>
+              <w:t>ы</w:t>
+            </w:r>
+            <w:r>
+              <w:t>(</w:t>
+            </w:r>
+            <w:proofErr w:type="spellStart"/>
+            <w:proofErr w:type="gramEnd"/>
+            <w:r>
+              <w:t>суперремнабор</w:t>
+            </w:r>
+            <w:proofErr w:type="spellEnd"/>
+            <w:r>
+              <w:t>)</w:t>
+            </w:r>
+            <w:r>
+              <w:t>,</w:t>
             </w:r>
           </w:p>
           <w:p>
@@ -5301,7 +5507,26 @@
           </w:tcPr>
           <w:p>
             <w:r>
-              <w:t>Инструменты.</w:t>
+              <w:t>Инструмент</w:t>
+            </w:r>
+            <w:proofErr w:type="gramStart"/>
+            <w:r>
+              <w:t>ы</w:t>
+            </w:r>
+            <w:r>
+              <w:t>(</w:t>
+            </w:r>
+            <w:proofErr w:type="spellStart"/>
+            <w:proofErr w:type="gramEnd"/>
+            <w:r>
+              <w:t>суперремнабор</w:t>
+            </w:r>
+            <w:proofErr w:type="spellEnd"/>
+            <w:r>
+              <w:t>)</w:t>
+            </w:r>
+            <w:r>
+              <w:t>.</w:t>
             </w:r>
           </w:p>
         </w:tc>
@@ -5389,7 +5614,26 @@
           </w:tcPr>
           <w:p>
             <w:r>
-              <w:t>Инструменты.</w:t>
+              <w:t>Инструмент</w:t>
+            </w:r>
+            <w:proofErr w:type="gramStart"/>
+            <w:r>
+              <w:t>ы</w:t>
+            </w:r>
+            <w:r>
+              <w:t>(</w:t>
+            </w:r>
+            <w:proofErr w:type="spellStart"/>
+            <w:proofErr w:type="gramEnd"/>
+            <w:r>
+              <w:t>суперремнабор</w:t>
+            </w:r>
+            <w:proofErr w:type="spellEnd"/>
+            <w:r>
+              <w:t>)</w:t>
+            </w:r>
+            <w:r>
+              <w:t>.</w:t>
             </w:r>
           </w:p>
         </w:tc>
@@ -5609,7 +5853,26 @@
           </w:tcPr>
           <w:p>
             <w:r>
-              <w:t>Инструменты,</w:t>
+              <w:t>Инструмент</w:t>
+            </w:r>
+            <w:proofErr w:type="gramStart"/>
+            <w:r>
+              <w:t>ы</w:t>
+            </w:r>
+            <w:r>
+              <w:t>(</w:t>
+            </w:r>
+            <w:proofErr w:type="spellStart"/>
+            <w:proofErr w:type="gramEnd"/>
+            <w:r>
+              <w:t>суперремнабор</w:t>
+            </w:r>
+            <w:proofErr w:type="spellEnd"/>
+            <w:r>
+              <w:t>)</w:t>
+            </w:r>
+            <w:r>
+              <w:t>,</w:t>
             </w:r>
           </w:p>
           <w:p>
@@ -6549,9 +6812,6 @@
               <w:t xml:space="preserve">Мал. Энергоблоки </w:t>
             </w:r>
             <w:r>
-              <w:rPr>
-                <w:lang w:val="en-US"/>
-              </w:rPr>
               <w:t>5</w:t>
             </w:r>
             <w:r>
@@ -6642,25 +6902,1099 @@
                 <w:b/>
               </w:rPr>
             </w:pPr>
+            <w:proofErr w:type="spellStart"/>
+            <w:r>
+              <w:rPr>
+                <w:b/>
+              </w:rPr>
+              <w:t>Нидлер</w:t>
+            </w:r>
+            <w:proofErr w:type="spellEnd"/>
           </w:p>
         </w:tc>
         <w:tc>
           <w:tcPr>
             <w:tcW w:w="1441" w:type="dxa"/>
           </w:tcPr>
+          <w:p>
+            <w:r>
+              <w:t>Ремонт 100,</w:t>
+            </w:r>
+          </w:p>
+          <w:p>
+            <w:r>
+              <w:t>Наука 120,</w:t>
+            </w:r>
+          </w:p>
+          <w:p>
+            <w:r>
+              <w:t>Легкое 60</w:t>
+            </w:r>
+          </w:p>
+        </w:tc>
+        <w:tc>
+          <w:tcPr>
+            <w:tcW w:w="2295" w:type="dxa"/>
+          </w:tcPr>
+          <w:p>
+            <w:proofErr w:type="gramStart"/>
+            <w:r>
+              <w:t>Железяки</w:t>
+            </w:r>
+            <w:proofErr w:type="gramEnd"/>
+            <w:r>
+              <w:t xml:space="preserve"> 2,</w:t>
+            </w:r>
+          </w:p>
+          <w:p>
+            <w:r>
+              <w:t>Картридж 5,</w:t>
+            </w:r>
+          </w:p>
+          <w:p>
+            <w:r>
+              <w:t>Мусор 3,</w:t>
+            </w:r>
+          </w:p>
+          <w:p>
+            <w:r>
+              <w:t>Самопа</w:t>
+            </w:r>
+            <w:proofErr w:type="gramStart"/>
+            <w:r>
+              <w:t>л(</w:t>
+            </w:r>
+            <w:proofErr w:type="gramEnd"/>
+            <w:r>
+              <w:t>пистолет) 1,</w:t>
+            </w:r>
+          </w:p>
+          <w:p>
+            <w:r>
+              <w:t>Микросхемы 1.</w:t>
+            </w:r>
+          </w:p>
+        </w:tc>
+        <w:tc>
+          <w:tcPr>
+            <w:tcW w:w="2268" w:type="dxa"/>
+          </w:tcPr>
+          <w:p>
+            <w:proofErr w:type="spellStart"/>
+            <w:r>
+              <w:t>Суперемнабор</w:t>
+            </w:r>
+            <w:proofErr w:type="spellEnd"/>
+            <w:r>
+              <w:t>,</w:t>
+            </w:r>
+          </w:p>
+          <w:p>
+            <w:r>
+              <w:t>«Пушки и Пули»</w:t>
+            </w:r>
+          </w:p>
+        </w:tc>
+        <w:tc>
+          <w:tcPr>
+            <w:tcW w:w="567" w:type="dxa"/>
+          </w:tcPr>
+          <w:p>
+            <w:pPr>
+              <w:rPr>
+                <w:b/>
+              </w:rPr>
+            </w:pPr>
+            <w:r>
+              <w:rPr>
+                <w:b/>
+              </w:rPr>
+              <w:t>1</w:t>
+            </w:r>
+          </w:p>
+        </w:tc>
+        <w:tc>
+          <w:tcPr>
+            <w:tcW w:w="635" w:type="dxa"/>
+          </w:tcPr>
+          <w:p>
+            <w:r>
+              <w:t>500</w:t>
+            </w:r>
+          </w:p>
+        </w:tc>
+      </w:tr>
+      <w:tr>
+        <w:trPr>
+          <w:trHeight w:val="267"/>
+        </w:trPr>
+        <w:tc>
+          <w:tcPr>
+            <w:tcW w:w="1969" w:type="dxa"/>
+          </w:tcPr>
+          <w:p>
+            <w:pPr>
+              <w:rPr>
+                <w:b/>
+              </w:rPr>
+            </w:pPr>
+            <w:r>
+              <w:rPr>
+                <w:b/>
+              </w:rPr>
+              <w:t>Картриджи</w:t>
+            </w:r>
+          </w:p>
+          <w:p>
+            <w:pPr>
+              <w:rPr>
+                <w:b/>
+              </w:rPr>
+            </w:pPr>
+            <w:r>
+              <w:rPr>
+                <w:b/>
+              </w:rPr>
+              <w:t xml:space="preserve">Для </w:t>
+            </w:r>
+            <w:proofErr w:type="spellStart"/>
+            <w:r>
+              <w:rPr>
+                <w:b/>
+              </w:rPr>
+              <w:t>нидлера</w:t>
+            </w:r>
+            <w:proofErr w:type="spellEnd"/>
+          </w:p>
+        </w:tc>
+        <w:tc>
+          <w:tcPr>
+            <w:tcW w:w="1441" w:type="dxa"/>
+          </w:tcPr>
+          <w:p>
+            <w:r>
+              <w:t>Ремонт 60,</w:t>
+            </w:r>
+          </w:p>
+          <w:p>
+            <w:r>
+              <w:t>Наука 80,</w:t>
+            </w:r>
+          </w:p>
+          <w:p>
+            <w:r>
+              <w:t>Легкое 60.</w:t>
+            </w:r>
+          </w:p>
+        </w:tc>
+        <w:tc>
+          <w:tcPr>
+            <w:tcW w:w="2295" w:type="dxa"/>
+          </w:tcPr>
+          <w:p>
+            <w:r>
+              <w:t>Химикаты 1,</w:t>
+            </w:r>
+          </w:p>
+          <w:p>
+            <w:r>
+              <w:t>Мусор 5.</w:t>
+            </w:r>
+          </w:p>
+        </w:tc>
+        <w:tc>
+          <w:tcPr>
+            <w:tcW w:w="2268" w:type="dxa"/>
+          </w:tcPr>
+          <w:p>
+            <w:proofErr w:type="spellStart"/>
+            <w:r>
+              <w:t>Суперемнабор</w:t>
+            </w:r>
+            <w:proofErr w:type="spellEnd"/>
+            <w:r>
+              <w:t>,</w:t>
+            </w:r>
+          </w:p>
+          <w:p>
+            <w:r>
+              <w:t>«Пушки и Пули»</w:t>
+            </w:r>
+          </w:p>
+          <w:p>
+            <w:r>
+              <w:t>Зажигалка</w:t>
+            </w:r>
+          </w:p>
+        </w:tc>
+        <w:tc>
+          <w:tcPr>
+            <w:tcW w:w="567" w:type="dxa"/>
+          </w:tcPr>
+          <w:p>
+            <w:pPr>
+              <w:rPr>
+                <w:b/>
+              </w:rPr>
+            </w:pPr>
+            <w:r>
+              <w:rPr>
+                <w:b/>
+              </w:rPr>
+              <w:t>10</w:t>
+            </w:r>
+          </w:p>
+        </w:tc>
+        <w:tc>
+          <w:tcPr>
+            <w:tcW w:w="635" w:type="dxa"/>
+          </w:tcPr>
+          <w:p>
+            <w:r>
+              <w:t>200</w:t>
+            </w:r>
+          </w:p>
+        </w:tc>
+      </w:tr>
+      <w:tr>
+        <w:trPr>
+          <w:trHeight w:val="267"/>
+        </w:trPr>
+        <w:tc>
+          <w:tcPr>
+            <w:tcW w:w="1969" w:type="dxa"/>
+          </w:tcPr>
+          <w:p>
+            <w:pPr>
+              <w:rPr>
+                <w:b/>
+              </w:rPr>
+            </w:pPr>
+            <w:r>
+              <w:rPr>
+                <w:b/>
+              </w:rPr>
+              <w:t>Картриджи с ядом.</w:t>
+            </w:r>
+          </w:p>
+        </w:tc>
+        <w:tc>
+          <w:tcPr>
+            <w:tcW w:w="1441" w:type="dxa"/>
+          </w:tcPr>
+          <w:p>
+            <w:r>
+              <w:t>Ремонт 60,</w:t>
+            </w:r>
+          </w:p>
+          <w:p>
+            <w:r>
+              <w:t>Наука 100,</w:t>
+            </w:r>
+          </w:p>
+          <w:p>
+            <w:r>
+              <w:t>Легкое 60.</w:t>
+            </w:r>
+          </w:p>
+        </w:tc>
+        <w:tc>
+          <w:tcPr>
+            <w:tcW w:w="2295" w:type="dxa"/>
+          </w:tcPr>
+          <w:p>
+            <w:r>
+              <w:t>Химикаты 1,</w:t>
+            </w:r>
+          </w:p>
+          <w:p>
+            <w:r>
+              <w:t>Хвосты скорпиона 2,</w:t>
+            </w:r>
+          </w:p>
+          <w:p>
+            <w:r>
+              <w:t>Картриджи 10,</w:t>
+            </w:r>
+          </w:p>
+          <w:p>
+            <w:proofErr w:type="gramStart"/>
+            <w:r>
+              <w:t>Железяки</w:t>
+            </w:r>
+            <w:proofErr w:type="gramEnd"/>
+            <w:r>
+              <w:t xml:space="preserve"> 1.</w:t>
+            </w:r>
+          </w:p>
+        </w:tc>
+        <w:tc>
+          <w:tcPr>
+            <w:tcW w:w="2268" w:type="dxa"/>
+          </w:tcPr>
+          <w:p>
+            <w:proofErr w:type="spellStart"/>
+            <w:r>
+              <w:t>Суперремнабор</w:t>
+            </w:r>
+            <w:proofErr w:type="spellEnd"/>
+            <w:r>
+              <w:t>,</w:t>
+            </w:r>
+          </w:p>
+          <w:p>
+            <w:r>
+              <w:t xml:space="preserve">Зажигалка, </w:t>
+            </w:r>
+          </w:p>
+          <w:p>
+            <w:r>
+              <w:t>Нож.</w:t>
+            </w:r>
+          </w:p>
+        </w:tc>
+        <w:tc>
+          <w:tcPr>
+            <w:tcW w:w="567" w:type="dxa"/>
+          </w:tcPr>
+          <w:p>
+            <w:pPr>
+              <w:rPr>
+                <w:b/>
+              </w:rPr>
+            </w:pPr>
+            <w:r>
+              <w:rPr>
+                <w:b/>
+              </w:rPr>
+              <w:t>10</w:t>
+            </w:r>
+          </w:p>
+        </w:tc>
+        <w:tc>
+          <w:tcPr>
+            <w:tcW w:w="635" w:type="dxa"/>
+          </w:tcPr>
+          <w:p>
+            <w:r>
+              <w:t>250</w:t>
+            </w:r>
+          </w:p>
+        </w:tc>
+      </w:tr>
+      <w:tr>
+        <w:trPr>
+          <w:trHeight w:val="267"/>
+        </w:trPr>
+        <w:tc>
+          <w:tcPr>
+            <w:tcW w:w="1969" w:type="dxa"/>
+          </w:tcPr>
+          <w:p>
+            <w:pPr>
+              <w:rPr>
+                <w:b/>
+              </w:rPr>
+            </w:pPr>
+            <w:proofErr w:type="spellStart"/>
+            <w:r>
+              <w:rPr>
+                <w:b/>
+              </w:rPr>
+              <w:t>Нейротоксин</w:t>
+            </w:r>
+            <w:proofErr w:type="spellEnd"/>
+            <w:r>
+              <w:rPr>
+                <w:b/>
+              </w:rPr>
+              <w:t>.</w:t>
+            </w:r>
+          </w:p>
+        </w:tc>
+        <w:tc>
+          <w:tcPr>
+            <w:tcW w:w="1441" w:type="dxa"/>
+          </w:tcPr>
+          <w:p>
+            <w:r>
+              <w:t>Наука 140.</w:t>
+            </w:r>
+          </w:p>
+        </w:tc>
+        <w:tc>
+          <w:tcPr>
+            <w:tcW w:w="2295" w:type="dxa"/>
+          </w:tcPr>
+          <w:p>
+            <w:r>
+              <w:t>Химикаты 1,</w:t>
+            </w:r>
+          </w:p>
+          <w:p>
+            <w:r>
+              <w:t>Шприц 1,</w:t>
+            </w:r>
+          </w:p>
+          <w:p>
+            <w:r>
+              <w:t>Пустые бутылки 2,</w:t>
+            </w:r>
+          </w:p>
+          <w:p>
+            <w:r>
+              <w:t>Хвосты скорпиона 8.</w:t>
+            </w:r>
+          </w:p>
+        </w:tc>
+        <w:tc>
+          <w:tcPr>
+            <w:tcW w:w="2268" w:type="dxa"/>
+          </w:tcPr>
+          <w:p>
+            <w:proofErr w:type="spellStart"/>
+            <w:r>
+              <w:t>Суперремнабор</w:t>
+            </w:r>
+            <w:proofErr w:type="spellEnd"/>
+            <w:r>
+              <w:t>,</w:t>
+            </w:r>
+          </w:p>
+          <w:p>
+            <w:r>
+              <w:t>Зажигалка,</w:t>
+            </w:r>
+          </w:p>
+          <w:p>
+            <w:r>
+              <w:t>Нож.</w:t>
+            </w:r>
+          </w:p>
+        </w:tc>
+        <w:tc>
+          <w:tcPr>
+            <w:tcW w:w="567" w:type="dxa"/>
+          </w:tcPr>
+          <w:p>
+            <w:pPr>
+              <w:rPr>
+                <w:b/>
+              </w:rPr>
+            </w:pPr>
+            <w:r>
+              <w:rPr>
+                <w:b/>
+              </w:rPr>
+              <w:t>1</w:t>
+            </w:r>
+          </w:p>
+        </w:tc>
+        <w:tc>
+          <w:tcPr>
+            <w:tcW w:w="635" w:type="dxa"/>
+          </w:tcPr>
+          <w:p>
+            <w:r>
+              <w:t>350</w:t>
+            </w:r>
+          </w:p>
+        </w:tc>
+      </w:tr>
+      <w:tr>
+        <w:trPr>
+          <w:trHeight w:val="267"/>
+        </w:trPr>
+        <w:tc>
+          <w:tcPr>
+            <w:tcW w:w="1969" w:type="dxa"/>
+          </w:tcPr>
+          <w:p>
+            <w:pPr>
+              <w:rPr>
+                <w:b/>
+              </w:rPr>
+            </w:pPr>
+            <w:r>
+              <w:rPr>
+                <w:b/>
+              </w:rPr>
+              <w:t xml:space="preserve">Картриджи с </w:t>
+            </w:r>
+            <w:proofErr w:type="spellStart"/>
+            <w:r>
+              <w:rPr>
+                <w:b/>
+              </w:rPr>
+              <w:t>нейротоксином</w:t>
+            </w:r>
+            <w:proofErr w:type="spellEnd"/>
+            <w:r>
+              <w:rPr>
+                <w:b/>
+              </w:rPr>
+              <w:t>.</w:t>
+            </w:r>
+          </w:p>
+        </w:tc>
+        <w:tc>
+          <w:tcPr>
+            <w:tcW w:w="1441" w:type="dxa"/>
+          </w:tcPr>
+          <w:p>
+            <w:r>
+              <w:t>Ремонт 60,</w:t>
+            </w:r>
+          </w:p>
+          <w:p>
+            <w:r>
+              <w:t>Наука 8</w:t>
+            </w:r>
+            <w:r>
+              <w:t>0,</w:t>
+            </w:r>
+          </w:p>
+          <w:p>
+            <w:r>
+              <w:t>Легкое 60.</w:t>
+            </w:r>
+          </w:p>
+        </w:tc>
+        <w:tc>
+          <w:tcPr>
+            <w:tcW w:w="2295" w:type="dxa"/>
+          </w:tcPr>
+          <w:p>
+            <w:proofErr w:type="spellStart"/>
+            <w:r>
+              <w:t>Нейротоксин</w:t>
+            </w:r>
+            <w:proofErr w:type="spellEnd"/>
+            <w:r>
+              <w:t xml:space="preserve"> 1</w:t>
+            </w:r>
+          </w:p>
+          <w:p>
+            <w:r>
+              <w:t>Картриджи 10.</w:t>
+            </w:r>
+          </w:p>
+        </w:tc>
+        <w:tc>
+          <w:tcPr>
+            <w:tcW w:w="2268" w:type="dxa"/>
+          </w:tcPr>
+          <w:p>
+            <w:proofErr w:type="spellStart"/>
+            <w:r>
+              <w:t>Суперремнабор</w:t>
+            </w:r>
+            <w:proofErr w:type="spellEnd"/>
+            <w:r>
+              <w:t>,</w:t>
+            </w:r>
+          </w:p>
+          <w:p>
+            <w:r>
+              <w:t>Зажигалка,</w:t>
+            </w:r>
+          </w:p>
+          <w:p>
+            <w:r>
+              <w:t>Нож.</w:t>
+            </w:r>
+          </w:p>
+        </w:tc>
+        <w:tc>
+          <w:tcPr>
+            <w:tcW w:w="567" w:type="dxa"/>
+          </w:tcPr>
+          <w:p>
+            <w:pPr>
+              <w:rPr>
+                <w:b/>
+              </w:rPr>
+            </w:pPr>
+            <w:r>
+              <w:rPr>
+                <w:b/>
+              </w:rPr>
+              <w:t>10</w:t>
+            </w:r>
+          </w:p>
+        </w:tc>
+        <w:tc>
+          <w:tcPr>
+            <w:tcW w:w="635" w:type="dxa"/>
+          </w:tcPr>
+          <w:p>
+            <w:r>
+              <w:t>400</w:t>
+            </w:r>
+          </w:p>
+        </w:tc>
+      </w:tr>
+      <w:tr>
+        <w:trPr>
+          <w:trHeight w:val="267"/>
+        </w:trPr>
+        <w:tc>
+          <w:tcPr>
+            <w:tcW w:w="1969" w:type="dxa"/>
+          </w:tcPr>
+          <w:p>
+            <w:pPr>
+              <w:rPr>
+                <w:b/>
+              </w:rPr>
+            </w:pPr>
+            <w:r>
+              <w:rPr>
+                <w:b/>
+              </w:rPr>
+              <w:t>Куски веревки.</w:t>
+            </w:r>
+          </w:p>
+        </w:tc>
+        <w:tc>
+          <w:tcPr>
+            <w:tcW w:w="1441" w:type="dxa"/>
+          </w:tcPr>
+          <w:p>
+            <w:r>
+              <w:t>Холодное оружие 20.</w:t>
+            </w:r>
+          </w:p>
+        </w:tc>
+        <w:tc>
+          <w:tcPr>
+            <w:tcW w:w="2295" w:type="dxa"/>
+          </w:tcPr>
+          <w:p>
+            <w:r>
+              <w:t>Веревка 1.</w:t>
+            </w:r>
+          </w:p>
+        </w:tc>
+        <w:tc>
+          <w:tcPr>
+            <w:tcW w:w="2268" w:type="dxa"/>
+          </w:tcPr>
+          <w:p>
+            <w:r>
+              <w:t>Любой нож или топор.</w:t>
+            </w:r>
+          </w:p>
+        </w:tc>
+        <w:tc>
+          <w:tcPr>
+            <w:tcW w:w="567" w:type="dxa"/>
+          </w:tcPr>
+          <w:p>
+            <w:pPr>
+              <w:rPr>
+                <w:b/>
+              </w:rPr>
+            </w:pPr>
+            <w:r>
+              <w:rPr>
+                <w:b/>
+              </w:rPr>
+              <w:t>10</w:t>
+            </w:r>
+          </w:p>
+        </w:tc>
+        <w:tc>
+          <w:tcPr>
+            <w:tcW w:w="635" w:type="dxa"/>
+          </w:tcPr>
+          <w:p>
+            <w:r>
+              <w:t>10</w:t>
+            </w:r>
+          </w:p>
+        </w:tc>
+      </w:tr>
+      <w:tr>
+        <w:trPr>
+          <w:trHeight w:val="267"/>
+        </w:trPr>
+        <w:tc>
+          <w:tcPr>
+            <w:tcW w:w="1969" w:type="dxa"/>
+          </w:tcPr>
+          <w:p>
+            <w:pPr>
+              <w:rPr>
+                <w:b/>
+              </w:rPr>
+            </w:pPr>
+            <w:r>
+              <w:rPr>
+                <w:b/>
+              </w:rPr>
+              <w:t>Веревка.</w:t>
+            </w:r>
+          </w:p>
+        </w:tc>
+        <w:tc>
+          <w:tcPr>
+            <w:tcW w:w="1441" w:type="dxa"/>
+          </w:tcPr>
+          <w:p>
+            <w:r>
+              <w:t>-</w:t>
+            </w:r>
+          </w:p>
+        </w:tc>
+        <w:tc>
+          <w:tcPr>
+            <w:tcW w:w="2295" w:type="dxa"/>
+          </w:tcPr>
+          <w:p>
+            <w:r>
+              <w:t>Куски веревки 20.</w:t>
+            </w:r>
+          </w:p>
+        </w:tc>
+        <w:tc>
+          <w:tcPr>
+            <w:tcW w:w="2268" w:type="dxa"/>
+          </w:tcPr>
+          <w:p>
+            <w:r>
+              <w:t>-</w:t>
+            </w:r>
+          </w:p>
+        </w:tc>
+        <w:tc>
+          <w:tcPr>
+            <w:tcW w:w="567" w:type="dxa"/>
+          </w:tcPr>
+          <w:p>
+            <w:pPr>
+              <w:rPr>
+                <w:b/>
+              </w:rPr>
+            </w:pPr>
+            <w:r>
+              <w:rPr>
+                <w:b/>
+              </w:rPr>
+              <w:t>1</w:t>
+            </w:r>
+          </w:p>
+        </w:tc>
+        <w:tc>
+          <w:tcPr>
+            <w:tcW w:w="635" w:type="dxa"/>
+          </w:tcPr>
+          <w:p>
+            <w:r>
+              <w:t>30</w:t>
+            </w:r>
+          </w:p>
+        </w:tc>
+      </w:tr>
+      <w:tr>
+        <w:trPr>
+          <w:trHeight w:val="267"/>
+        </w:trPr>
+        <w:tc>
+          <w:tcPr>
+            <w:tcW w:w="1969" w:type="dxa"/>
+          </w:tcPr>
+          <w:p>
+            <w:pPr>
+              <w:rPr>
+                <w:b/>
+              </w:rPr>
+            </w:pPr>
+            <w:r>
+              <w:rPr>
+                <w:b/>
+              </w:rPr>
+              <w:t>Антидот</w:t>
+            </w:r>
+          </w:p>
+        </w:tc>
+        <w:tc>
+          <w:tcPr>
+            <w:tcW w:w="1441" w:type="dxa"/>
+          </w:tcPr>
+          <w:p>
+            <w:r>
+              <w:t>Наука 100</w:t>
+            </w:r>
+          </w:p>
+        </w:tc>
+        <w:tc>
+          <w:tcPr>
+            <w:tcW w:w="2295" w:type="dxa"/>
+          </w:tcPr>
+          <w:p>
+            <w:r>
+              <w:t>Химикаты 1,</w:t>
+            </w:r>
+          </w:p>
+          <w:p>
+            <w:r>
+              <w:t>Шприц 3,</w:t>
+            </w:r>
+          </w:p>
+          <w:p>
+            <w:r>
+              <w:t>Бутылки 2,</w:t>
+            </w:r>
+          </w:p>
+          <w:p>
+            <w:proofErr w:type="spellStart"/>
+            <w:r>
+              <w:t>Нейротоксин</w:t>
+            </w:r>
+            <w:proofErr w:type="spellEnd"/>
+            <w:r>
+              <w:t xml:space="preserve"> 1.</w:t>
+            </w:r>
+          </w:p>
+        </w:tc>
+        <w:tc>
+          <w:tcPr>
+            <w:tcW w:w="2268" w:type="dxa"/>
+          </w:tcPr>
+          <w:p>
+            <w:r>
+              <w:t>Химические журналы,</w:t>
+            </w:r>
+          </w:p>
+          <w:p>
+            <w:r>
+              <w:t>Зажигалка.</w:t>
+            </w:r>
+          </w:p>
+        </w:tc>
+        <w:tc>
+          <w:tcPr>
+            <w:tcW w:w="567" w:type="dxa"/>
+          </w:tcPr>
+          <w:p>
+            <w:pPr>
+              <w:rPr>
+                <w:b/>
+              </w:rPr>
+            </w:pPr>
+            <w:r>
+              <w:rPr>
+                <w:b/>
+              </w:rPr>
+              <w:t>3</w:t>
+            </w:r>
+          </w:p>
+        </w:tc>
+        <w:tc>
+          <w:tcPr>
+            <w:tcW w:w="635" w:type="dxa"/>
+          </w:tcPr>
+          <w:p>
+            <w:r>
+              <w:t>450</w:t>
+            </w:r>
+          </w:p>
+        </w:tc>
+      </w:tr>
+      <w:tr>
+        <w:trPr>
+          <w:trHeight w:val="267"/>
+        </w:trPr>
+        <w:tc>
+          <w:tcPr>
+            <w:tcW w:w="1969" w:type="dxa"/>
+          </w:tcPr>
+          <w:p>
+            <w:pPr>
+              <w:rPr>
+                <w:b/>
+              </w:rPr>
+            </w:pPr>
+            <w:r>
+              <w:rPr>
+                <w:b/>
+              </w:rPr>
+              <w:t>Наручники</w:t>
+            </w:r>
+          </w:p>
+        </w:tc>
+        <w:tc>
+          <w:tcPr>
+            <w:tcW w:w="1441" w:type="dxa"/>
+          </w:tcPr>
+          <w:p>
+            <w:r>
+              <w:t>Наука 60,</w:t>
+            </w:r>
+          </w:p>
+          <w:p>
+            <w:r>
+              <w:t>Ремонт 100,</w:t>
+            </w:r>
+          </w:p>
+          <w:p>
+            <w:r>
+              <w:t>Взлом 100.</w:t>
+            </w:r>
+          </w:p>
+        </w:tc>
+        <w:tc>
+          <w:tcPr>
+            <w:tcW w:w="2295" w:type="dxa"/>
+          </w:tcPr>
+          <w:p>
+            <w:proofErr w:type="gramStart"/>
+            <w:r>
+              <w:t>Железяки</w:t>
+            </w:r>
+            <w:proofErr w:type="gramEnd"/>
+            <w:r>
+              <w:t xml:space="preserve"> 3,</w:t>
+            </w:r>
+          </w:p>
+          <w:p>
+            <w:r>
+              <w:t>Мусор 2.</w:t>
+            </w:r>
+          </w:p>
           <w:p/>
         </w:tc>
         <w:tc>
           <w:tcPr>
+            <w:tcW w:w="2268" w:type="dxa"/>
+          </w:tcPr>
+          <w:p>
+            <w:proofErr w:type="spellStart"/>
+            <w:r>
+              <w:t>Суперремнабор</w:t>
+            </w:r>
+            <w:proofErr w:type="spellEnd"/>
+            <w:r>
+              <w:t>,</w:t>
+            </w:r>
+          </w:p>
+          <w:p>
+            <w:r>
+              <w:t>«Пушки и Пули»,</w:t>
+            </w:r>
+          </w:p>
+          <w:p>
+            <w:r>
+              <w:t>Сварка.</w:t>
+            </w:r>
+          </w:p>
+        </w:tc>
+        <w:tc>
+          <w:tcPr>
+            <w:tcW w:w="567" w:type="dxa"/>
+          </w:tcPr>
+          <w:p>
+            <w:pPr>
+              <w:rPr>
+                <w:b/>
+              </w:rPr>
+            </w:pPr>
+            <w:r>
+              <w:rPr>
+                <w:b/>
+              </w:rPr>
+              <w:t>1</w:t>
+            </w:r>
+          </w:p>
+        </w:tc>
+        <w:tc>
+          <w:tcPr>
+            <w:tcW w:w="635" w:type="dxa"/>
+          </w:tcPr>
+          <w:p>
+            <w:r>
+              <w:t>500</w:t>
+            </w:r>
+          </w:p>
+        </w:tc>
+      </w:tr>
+      <w:tr>
+        <w:trPr>
+          <w:trHeight w:val="267"/>
+        </w:trPr>
+        <w:tc>
+          <w:tcPr>
+            <w:tcW w:w="1969" w:type="dxa"/>
+          </w:tcPr>
+          <w:p>
+            <w:pPr>
+              <w:rPr>
+                <w:b/>
+              </w:rPr>
+            </w:pPr>
+            <w:r>
+              <w:rPr>
+                <w:b/>
+              </w:rPr>
+              <w:t>Наручники</w:t>
+            </w:r>
+          </w:p>
+        </w:tc>
+        <w:tc>
+          <w:tcPr>
+            <w:tcW w:w="1441" w:type="dxa"/>
+          </w:tcPr>
+          <w:p>
+            <w:r>
+              <w:t>Ремонт 60,</w:t>
+            </w:r>
+          </w:p>
+          <w:p>
+            <w:r>
+              <w:t>Взлом 40.</w:t>
+            </w:r>
+          </w:p>
+        </w:tc>
+        <w:tc>
+          <w:tcPr>
             <w:tcW w:w="2295" w:type="dxa"/>
           </w:tcPr>
-          <w:p/>
+          <w:p>
+            <w:proofErr w:type="gramStart"/>
+            <w:r>
+              <w:t>Железяки</w:t>
+            </w:r>
+            <w:proofErr w:type="gramEnd"/>
+            <w:r>
+              <w:t xml:space="preserve"> 1,</w:t>
+            </w:r>
+          </w:p>
+          <w:p>
+            <w:r>
+              <w:t>Сломанные наручники 1.</w:t>
+            </w:r>
+          </w:p>
         </w:tc>
         <w:tc>
           <w:tcPr>
             <w:tcW w:w="2268" w:type="dxa"/>
           </w:tcPr>
-          <w:p/>
+          <w:p>
+            <w:proofErr w:type="spellStart"/>
+            <w:r>
+              <w:t>Суперремнабор</w:t>
+            </w:r>
+            <w:proofErr w:type="spellEnd"/>
+            <w:r>
+              <w:t>,</w:t>
+            </w:r>
+          </w:p>
+          <w:p>
+            <w:r>
+              <w:t>Сварка.</w:t>
+            </w:r>
+          </w:p>
         </w:tc>
         <w:tc>
           <w:tcPr>
@@ -6672,13 +8006,404 @@
                 <w:b/>
               </w:rPr>
             </w:pPr>
+            <w:r>
+              <w:rPr>
+                <w:b/>
+              </w:rPr>
+              <w:t>1</w:t>
+            </w:r>
           </w:p>
         </w:tc>
         <w:tc>
           <w:tcPr>
             <w:tcW w:w="635" w:type="dxa"/>
           </w:tcPr>
-          <w:p/>
+          <w:p>
+            <w:r>
+              <w:t>250</w:t>
+            </w:r>
+          </w:p>
+        </w:tc>
+      </w:tr>
+      <w:tr>
+        <w:trPr>
+          <w:trHeight w:val="267"/>
+        </w:trPr>
+        <w:tc>
+          <w:tcPr>
+            <w:tcW w:w="1969" w:type="dxa"/>
+          </w:tcPr>
+          <w:p>
+            <w:pPr>
+              <w:rPr>
+                <w:b/>
+              </w:rPr>
+            </w:pPr>
+            <w:r>
+              <w:rPr>
+                <w:b/>
+              </w:rPr>
+              <w:t>Кольт М1911</w:t>
+            </w:r>
+          </w:p>
+        </w:tc>
+        <w:tc>
+          <w:tcPr>
+            <w:tcW w:w="1441" w:type="dxa"/>
+          </w:tcPr>
+          <w:p>
+            <w:r>
+              <w:t>Ремонт 100,</w:t>
+            </w:r>
+          </w:p>
+          <w:p>
+            <w:r>
+              <w:t>Легкое 120.</w:t>
+            </w:r>
+          </w:p>
+        </w:tc>
+        <w:tc>
+          <w:tcPr>
+            <w:tcW w:w="2295" w:type="dxa"/>
+          </w:tcPr>
+          <w:p>
+            <w:r>
+              <w:t>Пистолет 10мм 1,</w:t>
+            </w:r>
+          </w:p>
+          <w:p>
+            <w:proofErr w:type="gramStart"/>
+            <w:r>
+              <w:t>Железяки</w:t>
+            </w:r>
+            <w:proofErr w:type="gramEnd"/>
+            <w:r>
+              <w:t xml:space="preserve"> 1,</w:t>
+            </w:r>
+          </w:p>
+          <w:p>
+            <w:r>
+              <w:t>Труба 1,</w:t>
+            </w:r>
+          </w:p>
+          <w:p>
+            <w:r>
+              <w:t>Мусор 2,</w:t>
+            </w:r>
+          </w:p>
+          <w:p>
+            <w:r>
+              <w:t>Патроны .45 – 7.</w:t>
+            </w:r>
+          </w:p>
+        </w:tc>
+        <w:tc>
+          <w:tcPr>
+            <w:tcW w:w="2268" w:type="dxa"/>
+          </w:tcPr>
+          <w:p>
+            <w:proofErr w:type="spellStart"/>
+            <w:r>
+              <w:t>Суперремнабор</w:t>
+            </w:r>
+            <w:proofErr w:type="spellEnd"/>
+            <w:r>
+              <w:t>,</w:t>
+            </w:r>
+          </w:p>
+          <w:p>
+            <w:r>
+              <w:t>Сварка.</w:t>
+            </w:r>
+          </w:p>
+        </w:tc>
+        <w:tc>
+          <w:tcPr>
+            <w:tcW w:w="567" w:type="dxa"/>
+          </w:tcPr>
+          <w:p>
+            <w:pPr>
+              <w:rPr>
+                <w:b/>
+              </w:rPr>
+            </w:pPr>
+            <w:r>
+              <w:rPr>
+                <w:b/>
+              </w:rPr>
+              <w:t>1</w:t>
+            </w:r>
+          </w:p>
+        </w:tc>
+        <w:tc>
+          <w:tcPr>
+            <w:tcW w:w="635" w:type="dxa"/>
+          </w:tcPr>
+          <w:p>
+            <w:r>
+              <w:t>450</w:t>
+            </w:r>
+          </w:p>
+        </w:tc>
+      </w:tr>
+      <w:tr>
+        <w:trPr>
+          <w:trHeight w:val="267"/>
+        </w:trPr>
+        <w:tc>
+          <w:tcPr>
+            <w:tcW w:w="1969" w:type="dxa"/>
+          </w:tcPr>
+          <w:p>
+            <w:pPr>
+              <w:rPr>
+                <w:b/>
+              </w:rPr>
+            </w:pPr>
+            <w:r>
+              <w:rPr>
+                <w:b/>
+              </w:rPr>
+              <w:t>Железная броня мутантов.</w:t>
+            </w:r>
+          </w:p>
+        </w:tc>
+        <w:tc>
+          <w:tcPr>
+            <w:tcW w:w="1441" w:type="dxa"/>
+          </w:tcPr>
+          <w:p>
+            <w:r>
+              <w:t>Ремонт 100,</w:t>
+            </w:r>
+          </w:p>
+          <w:p>
+            <w:r>
+              <w:t>Скиталец 80.</w:t>
+            </w:r>
+          </w:p>
+        </w:tc>
+        <w:tc>
+          <w:tcPr>
+            <w:tcW w:w="2295" w:type="dxa"/>
+          </w:tcPr>
+          <w:p>
+            <w:proofErr w:type="gramStart"/>
+            <w:r>
+              <w:t>Железяки</w:t>
+            </w:r>
+            <w:proofErr w:type="gramEnd"/>
+            <w:r>
+              <w:t xml:space="preserve"> 8.</w:t>
+            </w:r>
+          </w:p>
+          <w:p>
+            <w:r>
+              <w:t>Шкура зол</w:t>
+            </w:r>
+            <w:proofErr w:type="gramStart"/>
+            <w:r>
+              <w:t>.</w:t>
+            </w:r>
+            <w:proofErr w:type="gramEnd"/>
+            <w:r>
+              <w:t xml:space="preserve"> </w:t>
+            </w:r>
+            <w:proofErr w:type="gramStart"/>
+            <w:r>
+              <w:t>я</w:t>
+            </w:r>
+            <w:proofErr w:type="gramEnd"/>
+            <w:r>
+              <w:t>щера 4,</w:t>
+            </w:r>
+          </w:p>
+          <w:p>
+            <w:r>
+              <w:t>Мусор 2,</w:t>
+            </w:r>
+          </w:p>
+          <w:p>
+            <w:r>
+              <w:t>Сварка 1.</w:t>
+            </w:r>
+          </w:p>
+        </w:tc>
+        <w:tc>
+          <w:tcPr>
+            <w:tcW w:w="2268" w:type="dxa"/>
+          </w:tcPr>
+          <w:p>
+            <w:r>
+              <w:t>Сварка,</w:t>
+            </w:r>
+          </w:p>
+          <w:p>
+            <w:r>
+              <w:t>Но</w:t>
+            </w:r>
+            <w:proofErr w:type="gramStart"/>
+            <w:r>
+              <w:t>ж(</w:t>
+            </w:r>
+            <w:proofErr w:type="gramEnd"/>
+            <w:r>
+              <w:t>боевой нож)</w:t>
+            </w:r>
+          </w:p>
+        </w:tc>
+        <w:tc>
+          <w:tcPr>
+            <w:tcW w:w="567" w:type="dxa"/>
+          </w:tcPr>
+          <w:p>
+            <w:pPr>
+              <w:rPr>
+                <w:b/>
+              </w:rPr>
+            </w:pPr>
+            <w:r>
+              <w:rPr>
+                <w:b/>
+              </w:rPr>
+              <w:t>1</w:t>
+            </w:r>
+          </w:p>
+        </w:tc>
+        <w:tc>
+          <w:tcPr>
+            <w:tcW w:w="635" w:type="dxa"/>
+          </w:tcPr>
+          <w:p>
+            <w:r>
+              <w:t>550</w:t>
+            </w:r>
+          </w:p>
+        </w:tc>
+      </w:tr>
+      <w:tr>
+        <w:trPr>
+          <w:trHeight w:val="267"/>
+        </w:trPr>
+        <w:tc>
+          <w:tcPr>
+            <w:tcW w:w="1969" w:type="dxa"/>
+          </w:tcPr>
+          <w:p>
+            <w:pPr>
+              <w:rPr>
+                <w:b/>
+              </w:rPr>
+            </w:pPr>
+            <w:r>
+              <w:rPr>
+                <w:b/>
+              </w:rPr>
+              <w:t>Кожаная куртка мутантов.</w:t>
+            </w:r>
+          </w:p>
+        </w:tc>
+        <w:tc>
+          <w:tcPr>
+            <w:tcW w:w="1441" w:type="dxa"/>
+          </w:tcPr>
+          <w:p>
+            <w:r>
+              <w:t>Ремонт 80,</w:t>
+            </w:r>
+          </w:p>
+          <w:p>
+            <w:r>
+              <w:t>Скиталец 80.</w:t>
+            </w:r>
+          </w:p>
+        </w:tc>
+        <w:tc>
+          <w:tcPr>
+            <w:tcW w:w="2295" w:type="dxa"/>
+          </w:tcPr>
+          <w:p>
+            <w:r>
+              <w:t>Шкура ящера 4,</w:t>
+            </w:r>
+          </w:p>
+          <w:p>
+            <w:r>
+              <w:t>Шкура зол</w:t>
+            </w:r>
+            <w:proofErr w:type="gramStart"/>
+            <w:r>
+              <w:t>.</w:t>
+            </w:r>
+            <w:proofErr w:type="gramEnd"/>
+            <w:r>
+              <w:t xml:space="preserve"> </w:t>
+            </w:r>
+            <w:proofErr w:type="gramStart"/>
+            <w:r>
+              <w:t>я</w:t>
+            </w:r>
+            <w:proofErr w:type="gramEnd"/>
+            <w:r>
+              <w:t>щера 8,</w:t>
+            </w:r>
+          </w:p>
+          <w:p>
+            <w:r>
+              <w:t>Карманный мусор 4,</w:t>
+            </w:r>
+          </w:p>
+          <w:p>
+            <w:r>
+              <w:t>Химикаты 2.</w:t>
+            </w:r>
+          </w:p>
+        </w:tc>
+        <w:tc>
+          <w:tcPr>
+            <w:tcW w:w="2268" w:type="dxa"/>
+          </w:tcPr>
+          <w:p>
+            <w:r>
+              <w:t>Но</w:t>
+            </w:r>
+            <w:proofErr w:type="gramStart"/>
+            <w:r>
+              <w:t>ж(</w:t>
+            </w:r>
+            <w:proofErr w:type="gramEnd"/>
+            <w:r>
+              <w:t>боевой нож).</w:t>
+            </w:r>
+          </w:p>
+        </w:tc>
+        <w:tc>
+          <w:tcPr>
+            <w:tcW w:w="567" w:type="dxa"/>
+          </w:tcPr>
+          <w:p>
+            <w:pPr>
+              <w:rPr>
+                <w:b/>
+              </w:rPr>
+            </w:pPr>
+            <w:r>
+              <w:rPr>
+                <w:b/>
+              </w:rPr>
+              <w:t>1</w:t>
+            </w:r>
+          </w:p>
+        </w:tc>
+        <w:tc>
+          <w:tcPr>
+            <w:tcW w:w="635" w:type="dxa"/>
+          </w:tcPr>
+          <w:p>
+            <w:r>
+              <w:t>250</w:t>
+            </w:r>
+          </w:p>
         </w:tc>
       </w:tr>
     </w:tbl>

</xml_diff>